<commit_message>
fix(editorial): apply Robin Edits to Bourj Prison outputs + regen DOCX + fix shabeh spelling
</commit_message>
<xml_diff>
--- a/docs/output/Zain Hajahjah/سجن البرج/SRT-En/أحمد/DOCX/01_تفريغ عربي-الاعتقال_En.docx
+++ b/docs/output/Zain Hajahjah/سجن البرج/SRT-En/أحمد/DOCX/01_تفريغ عربي-الاعتقال_En.docx
@@ -4,87 +4,172 @@
   <w:body>
     <w:p>
       <w:r>
-        <w:t>I am Ahmad from the town of Tabqa, 25 years old</w:t>
+        <w:t>I am Ahmad from the</w:t>
       </w:r>
     </w:p>
     <w:p>
       <w:r>
-        <w:t>I was imprisoned by ISIS in 2016, during Ramadan, for 33 days</w:t>
+        <w:t>town of Tabqa, 25 years old</w:t>
       </w:r>
     </w:p>
     <w:p>
       <w:r>
-        <w:t>They put me in their prison for 33 days, during which I was tortured unjustly. I had not committed any offense</w:t>
+        <w:t>I was imprisoned by ISIS in</w:t>
       </w:r>
     </w:p>
     <w:p>
       <w:r>
-        <w:t>Because of one of my friends who had committed some wrongdoings, I used to hang out at his place</w:t>
+        <w:t>2016, during Ramadan, for 33 days</w:t>
       </w:r>
     </w:p>
     <w:p>
       <w:r>
-        <w:t>I left his house and he told me he had something entrusted to him and asked me to bring it on my way from the town of Mansoura</w:t>
+        <w:t>They put me in their prison for 33 days, during which I</w:t>
       </w:r>
     </w:p>
     <w:p>
       <w:r>
-        <w:t>I went and they caught me there. I was standing in front of a shop when a car came and masked men got out</w:t>
+        <w:t>was tortured unjustly. I had not committed any offense</w:t>
       </w:r>
     </w:p>
     <w:p>
       <w:r>
-        <w:t>Only their eyes were visible and they wore black. They arrested me immediately by name</w:t>
+        <w:t>Because of one of my friends who had committed</w:t>
       </w:r>
     </w:p>
     <w:p>
       <w:r>
-        <w:t>They put me in the trunk of the car, locked it, and asked me, where is Abdul Latif? Of course with beating and humiliation</w:t>
+        <w:t>some wrongdoings, I used to hang out at his place</w:t>
       </w:r>
     </w:p>
     <w:p>
       <w:r>
-        <w:t>Punches to my stomach and back. They locked the trunk on me and went looking for my friend Abdul Latif</w:t>
+        <w:t>I left his house and he told me he had something entrusted to</w:t>
       </w:r>
     </w:p>
     <w:p>
       <w:r>
-        <w:t>Neither of us knew what the issue was. They took us and put us in the Finance building in the town of Tabqa</w:t>
+        <w:t>him and asked me to bring it on my way from the town of Mansoura</w:t>
       </w:r>
     </w:p>
     <w:p>
       <w:r>
-        <w:t>In a basement, in a solitary cell, and of course they separated us</w:t>
+        <w:t>I went and they caught me there. I was standing in</w:t>
       </w:r>
     </w:p>
     <w:p>
       <w:r>
-        <w:t>They also brought in someone else we had been with the night before, named Nasser al-Ammar</w:t>
+        <w:t>front of a shop when a car came and masked men got out</w:t>
       </w:r>
     </w:p>
     <w:p>
       <w:r>
-        <w:t>They took us and searched for him for an hour and a half to two hours. He had fled because he knew he had done something</w:t>
+        <w:t>Only their eyes were visible and they wore</w:t>
       </w:r>
     </w:p>
     <w:p>
       <w:r>
-        <w:t>They brought him and put him with us on the &lt;i&gt;balingo&lt;/i&gt; [hoist for suspension] and kept us in prison for three days</w:t>
+        <w:t>black. They arrested me immediately by name</w:t>
       </w:r>
     </w:p>
     <w:p>
       <w:r>
-        <w:t>Then they brought us to Bourj [Tower] Prison, to the basement. Of course we were blindfolded and did not know where we were going</w:t>
+        <w:t>They put me in the trunk of the car, locked it, and asked me,</w:t>
       </w:r>
     </w:p>
     <w:p>
       <w:r>
-        <w:t>But since we were from the area, we knew where they were taking us. We felt we were in Bourj Prison</w:t>
+        <w:t>where is Abdul Latif? Of course with beating and humiliation</w:t>
       </w:r>
     </w:p>
     <w:p>
       <w:r>
-        <w:t>We went down and they put us in a dark place. The lights stayed on around the clock. We could not tell night from day</w:t>
+        <w:t>Punches to my stomach and back. They locked the trunk</w:t>
+      </w:r>
+    </w:p>
+    <w:p>
+      <w:r>
+        <w:t>on me and went looking for my friend Abdul Latif</w:t>
+      </w:r>
+    </w:p>
+    <w:p>
+      <w:r>
+        <w:t>Neither of us knew what the issue was. They took us</w:t>
+      </w:r>
+    </w:p>
+    <w:p>
+      <w:r>
+        <w:t>and put us in the Finance building in the town of Tabqa</w:t>
+      </w:r>
+    </w:p>
+    <w:p>
+      <w:r>
+        <w:t>In a basement, in a solitary cell,</w:t>
+      </w:r>
+    </w:p>
+    <w:p>
+      <w:r>
+        <w:t>and of course they separated us</w:t>
+      </w:r>
+    </w:p>
+    <w:p>
+      <w:r>
+        <w:t>They also brought in someone else we had been</w:t>
+      </w:r>
+    </w:p>
+    <w:p>
+      <w:r>
+        <w:t>with the night before, named Nasser al-Ammar</w:t>
+      </w:r>
+    </w:p>
+    <w:p>
+      <w:r>
+        <w:t>They took us and searched for him for an hour and a half to</w:t>
+      </w:r>
+    </w:p>
+    <w:p>
+      <w:r>
+        <w:t>two hours. He had fled because he knew he had done something</w:t>
+      </w:r>
+    </w:p>
+    <w:p>
+      <w:r>
+        <w:t>They brought him and put him with us on the balingo [hoist</w:t>
+      </w:r>
+    </w:p>
+    <w:p>
+      <w:r>
+        <w:t>for suspension] and kept us in prison for three days</w:t>
+      </w:r>
+    </w:p>
+    <w:p>
+      <w:r>
+        <w:t>Then they brought us to Bourj [Tower] Prison, to the basement. Of</w:t>
+      </w:r>
+    </w:p>
+    <w:p>
+      <w:r>
+        <w:t>course we were blindfolded and did not know where we were going</w:t>
+      </w:r>
+    </w:p>
+    <w:p>
+      <w:r>
+        <w:t>But since we were from the area, we knew where they</w:t>
+      </w:r>
+    </w:p>
+    <w:p>
+      <w:r>
+        <w:t>were taking us. We felt we were in Bourj Prison</w:t>
+      </w:r>
+    </w:p>
+    <w:p>
+      <w:r>
+        <w:t>We went down and they put us in a dark place. The lights</w:t>
+      </w:r>
+    </w:p>
+    <w:p>
+      <w:r>
+        <w:t>stayed on around the clock. We could not tell night from day</w:t>
       </w:r>
     </w:p>
     <w:sectPr>
@@ -461,7 +546,7 @@
     <w:qFormat/>
     <w:rsid w:val="00FC693F"/>
     <w:rPr>
-      <w:rFonts w:ascii="Calibri" w:hAnsi="Calibri"/>
+      <w:rFonts w:ascii="Arial" w:hAnsi="Arial"/>
       <w:sz w:val="22"/>
     </w:rPr>
   </w:style>

</xml_diff>